<commit_message>
Finalize rubric compliance and input safety
</commit_message>
<xml_diff>
--- a/docs/deliverables/Emdadyar_Final_Presentation_Runbook.docx
+++ b/docs/deliverables/Emdadyar_Final_Presentation_Runbook.docx
@@ -526,6 +526,44 @@
     </w:p>
     <w:p>
       <w:pPr>
+        <w:pStyle w:val="ListNumber"/>
+        <w:spacing w:before="0" w:after="80" w:line="300" w:lineRule="auto"/>
+        <w:jc w:val="right"/>
+        <w:bidi w:val="1"/>
+      </w:pPr>
+      <w:r>
+        <w:rPr>
+          <w:rFonts w:ascii="Arial" w:hAnsi="Arial" w:cs="Arial"/>
+          <w:b w:val="0"/>
+          <w:color w:val="15212B"/>
+          <w:sz w:val="22"/>
+          <w:rtl w:val="1"/>
+          <w:rtl w:val="1"/>
+        </w:rPr>
+        <w:t>برای معیار «استفاده واقعی»، فقط با رضایت فرد، یک ویدئوی ۱۰ تا ۱۵ ثانیه‌ای از کار با اپ یا یک تصویر واقعی و بی‌نام آماده کنید. اگر چنین شاهدی ندارید، آن را بازسازی نکنید؛ گزارش بازخوردهای تأییدشده را نشان دهید و محدودیت را صریح بگویید.</w:t>
+      </w:r>
+    </w:p>
+    <w:p>
+      <w:pPr>
+        <w:pStyle w:val="ListNumber"/>
+        <w:spacing w:before="0" w:after="80" w:line="300" w:lineRule="auto"/>
+        <w:jc w:val="right"/>
+        <w:bidi w:val="1"/>
+      </w:pPr>
+      <w:r>
+        <w:rPr>
+          <w:rFonts w:ascii="Arial" w:hAnsi="Arial" w:cs="Arial"/>
+          <w:b w:val="0"/>
+          <w:color w:val="15212B"/>
+          <w:sz w:val="22"/>
+          <w:rtl w:val="1"/>
+          <w:rtl w:val="1"/>
+        </w:rPr>
+        <w:t>پیش از ضبط، دسترسی استاد/تیم آموزشی به Jira و Notion را با یک مرورگر ناشناس آزمایش کنید.</w:t>
+      </w:r>
+    </w:p>
+    <w:p>
+      <w:pPr>
         <w:spacing w:before="320" w:after="160"/>
         <w:jc w:val="right"/>
         <w:keepNext/>
@@ -911,7 +949,7 @@
           <w:rtl w:val="1"/>
           <w:rtl w:val="1"/>
         </w:rPr>
-        <w:t xml:space="preserve"> گزارش ۹ بازخورد و Stakeholder Outreach Log.</w:t>
+        <w:t xml:space="preserve"> گزارش ۹ بازخورد، Stakeholder Outreach Log و در صورت وجود رضایت، شاهد کوتاه استفاده واقعی.</w:t>
       </w:r>
     </w:p>
     <w:p>
@@ -947,7 +985,7 @@
           <w:sz w:val="25"/>
           <w:rtl w:val="1"/>
         </w:rPr>
-        <w:t>۵:۳۵ تا ۶:۰۰ | محدودیت و تحویل</w:t>
+        <w:t>۵:۳۵ تا ۶:۰۰ | چالش واقعی و محدودیت</w:t>
       </w:r>
     </w:p>
     <w:p>
@@ -965,7 +1003,7 @@
           <w:rtl w:val="1"/>
           <w:rtl w:val="1"/>
         </w:rPr>
-        <w:t>«نتیجه فعلی یک MVP واقعی و قابل استفاده برای دمو و بازخورد است، نه سامانه بالینی آماده استقرار. اعتبارسنجی بیمارستانی، بررسی fairness و تطبیق با پروتکل، کارهای مرحله بعد هستند. محدثه در ادامه تجربه کاربر، تست و مدیریت دانش را توضیح می‌دهد.»</w:t>
+        <w:t>«دو ضعف واقعی پروژه، تمرکز اولیه کار فنی روی من و دیر ثبت شدن بخشی از مستندات بود. بعد از بازخورد TA نقش‌ها را بازتوزیع کردیم و شواهد را به commit و فایل متصل کردیم. نتیجه فعلی یک MVP واقعی برای دمو و بازخورد است، نه سامانه بالینی آماده استقرار. اعتبارسنجی بیمارستانی و بررسی fairness همچنان کار مرحله بعد است. محدثه تجربه کاربر، تست و مدیریت دانش را توضیح می‌دهد.»</w:t>
       </w:r>
     </w:p>
     <w:p>
@@ -1562,6 +1600,36 @@
         <w:t xml:space="preserve"> کمک به تحلیل، کدنویسی و بازبینی؛ تصمیم، پذیرش خروجی و مسئولیت نهایی با تیم بود.</w:t>
       </w:r>
     </w:p>
+    <w:p>
+      <w:pPr>
+        <w:pStyle w:val="ListBullet"/>
+        <w:spacing w:before="0" w:after="80" w:line="300" w:lineRule="auto"/>
+        <w:jc w:val="right"/>
+        <w:bidi w:val="1"/>
+      </w:pPr>
+      <w:r>
+        <w:rPr>
+          <w:rFonts w:ascii="Arial" w:hAnsi="Arial" w:cs="Arial"/>
+          <w:b w:val="0"/>
+          <w:color w:val="15212B"/>
+          <w:sz w:val="22"/>
+          <w:rtl w:val="1"/>
+          <w:rtl w:val="1"/>
+        </w:rPr>
+        <w:t>آیا Jira و Notion از روز اول فعال بوده‌اند؟</w:t>
+      </w:r>
+      <w:r>
+        <w:rPr>
+          <w:rFonts w:ascii="Arial" w:hAnsi="Arial" w:cs="Arial"/>
+          <w:b w:val="0"/>
+          <w:color w:val="15212B"/>
+          <w:sz w:val="22"/>
+          <w:rtl w:val="1"/>
+          <w:rtl w:val="1"/>
+        </w:rPr>
+        <w:t xml:space="preserve"> بخشی از ثبت‌ها در پایان، بر اساس تاریخچه Git و فایل‌های موجود به پلتفرم منتقل شده است؛ تاریخ واقعی کار و شاهد هر مورد جدا ثبت می‌شود و تاریخچه پلتفرم جعل نشده است.</w:t>
+      </w:r>
+    </w:p>
     <w:sectPr>
       <w:headerReference w:type="default" r:id="rId9"/>
       <w:footerReference w:type="default" r:id="rId10"/>
@@ -1614,7 +1682,7 @@
         <w:sz w:val="18"/>
         <w:rtl w:val="1"/>
       </w:rPr>
-      <w:t>امدادیار | سناریوی نهایی ارائه</w:t>
+      <w:t>امداد یار | سناریوی ارائه ۱۰ دقیقه‌ای</w:t>
     </w:r>
   </w:p>
 </w:hdr>

</xml_diff>

<commit_message>
Finalize safety validation and Android release
</commit_message>
<xml_diff>
--- a/docs/deliverables/Emdadyar_Final_Presentation_Runbook.docx
+++ b/docs/deliverables/Emdadyar_Final_Presentation_Runbook.docx
@@ -765,14 +765,11 @@
       </w:pPr>
       <w:r>
         <w:rPr>
-          <w:rFonts w:ascii="Arial" w:hAnsi="Arial" w:cs="Arial"/>
-          <w:b w:val="0"/>
-          <w:color w:val="15212B"/>
+          <w:rFonts w:ascii="Arial" w:hAnsi="Arial"/>
           <w:sz w:val="22"/>
-          <w:rtl w:val="1"/>
-          <w:rtl w:val="1"/>
+          <w:rtl/>
         </w:rPr>
-        <w:t>«مدل نهایی v7 فقط از اطلاعات زمان تریاژ استفاده می‌کند؛ داده‌های بعدی مثل آزمایش، تصویربرداری، دارو و نتیجه بستری حذف شده‌اند تا data leakage رخ ندهد. Threshold روی validation انتخاب شده و test فقط برای گزارش نهایی استفاده شده است. AUC برابر ۰٫۹۰۴۱ و Recall بیمار پرخطر ۰٫۹۲۴۶ است. Precision برابر ۰٫۵۴۴۷ و FPR برابر ۰٫۳۳۵۲ است. این دو عدد را هم گزارش کرده‌ایم، چون حساسیت بالا هزینه بازبینی بیشتر دارد و باید در محیط واقعی با ظرفیت مرکز درمانی تنظیم شود.»</w:t>
+        <w:t>«مدل نهایی v7 فقط از اطلاعات زمان تریاژ استفاده می‌کند؛ داده‌های بعدی مانند آزمایش، تصویربرداری، دارو و نتیجه بستری حذف شده‌اند تا data leakage رخ ندهد. Threshold روی validation انتخاب شده و بازتولید روی ۱۱۱٬۶۰۶ رکورد test همان AUC برابر ۰٫۹۰۴۱ و Recall برابر ۰٫۹۲۴۶ را بدون اختلاف تأیید کرد. قواعد ایمنی احتمال مدل را تغییر نمی‌دهند و فوریت را جداگانه ثبت می‌کنند.»</w:t>
       </w:r>
     </w:p>
     <w:p>
@@ -1144,14 +1141,11 @@
       </w:pPr>
       <w:r>
         <w:rPr>
-          <w:rFonts w:ascii="Arial" w:hAnsi="Arial" w:cs="Arial"/>
-          <w:b w:val="0"/>
-          <w:color w:val="15212B"/>
+          <w:rFonts w:ascii="Arial" w:hAnsi="Arial"/>
           <w:sz w:val="22"/>
-          <w:rtl w:val="1"/>
-          <w:rtl w:val="1"/>
+          <w:rtl/>
         </w:rPr>
-        <w:t>«تست‌ها شامل فرم خالی، بیمار پرخطر، وضعیت متوسط، داده کم، درد قفسه سینه، موبایل، PWA، QR، کپی خلاصه و پاک کردن فرم بود. بازخورد پرستاران فقط ثبت نشد؛ برای هر مورد یک اقدام انجام‌شده یا یک کار آینده داریم. نتیجه این بازبینی، نسخه‌ای کوتاه‌تر و کم‌ابهام‌تر شد.»</w:t>
+        <w:t>«QA فقط چند سناریوی نمایشی نبود: ۱۱۸ تست Python، ۱۰۷ مرز سن‌محور، ۵٬۰۰۰ ترکیب تصادفی و ۱٬۱۶۷ مقایسه مرورگر/API اجرا شد و اختلاف تصمیمی صفر بود. سناریوهای فرم خالی، بیمار پرخطر، وضعیت متوسط، داده کم، درد قفسه سینه و پاک‌کردن فرم نیز در Test Log ثبت شده‌اند. نصب APK روی گوشی فیزیکی را صادقانه به‌عنوان کار باز نگه داشته‌ایم.»</w:t>
       </w:r>
     </w:p>
     <w:p>
@@ -1489,25 +1483,11 @@
       </w:pPr>
       <w:r>
         <w:rPr>
-          <w:rFonts w:ascii="Arial" w:hAnsi="Arial" w:cs="Arial"/>
-          <w:b w:val="0"/>
-          <w:color w:val="15212B"/>
+          <w:rFonts w:ascii="Arial" w:hAnsi="Arial"/>
           <w:sz w:val="22"/>
-          <w:rtl w:val="1"/>
-          <w:rtl w:val="1"/>
+          <w:rtl/>
         </w:rPr>
-        <w:t>چرا FPR برابر ۰٫۳۳۵۲ است؟</w:t>
-      </w:r>
-      <w:r>
-        <w:rPr>
-          <w:rFonts w:ascii="Arial" w:hAnsi="Arial" w:cs="Arial"/>
-          <w:b w:val="0"/>
-          <w:color w:val="15212B"/>
-          <w:sz w:val="22"/>
-          <w:rtl w:val="1"/>
-          <w:rtl w:val="1"/>
-        </w:rPr>
-        <w:t xml:space="preserve"> حالت پیش‌فرض برای حفظ Recall بالا انتخاب شده؛ تنظیم نهایی باید با ظرفیت واقعی مرکز درمانی انجام شود.</w:t>
+        <w:t>چرا FPR برابر ۰٫۳۳۵۲ است؟ حالت پیش‌فرض برای حفظ Recall بالا انتخاب شده است. برای ورودی ناقص FPR بالاتر نیز جدا گزارش شده و گزینه فقط علائم حیاتی با FPR برابر ۰٫۷۸۴۰ عمداً از محصول کنار گذاشته شد؛ تنظیم نهایی باید با ظرفیت و پروتکل مرکز درمانی انجام شود.</w:t>
       </w:r>
     </w:p>
     <w:p>

</xml_diff>

<commit_message>
Complete Jira and Notion project evidence
</commit_message>
<xml_diff>
--- a/docs/deliverables/Emdadyar_Final_Presentation_Runbook.docx
+++ b/docs/deliverables/Emdadyar_Final_Presentation_Runbook.docx
@@ -457,14 +457,11 @@
       </w:pPr>
       <w:r>
         <w:rPr>
-          <w:rFonts w:ascii="Arial" w:hAnsi="Arial" w:cs="Arial"/>
-          <w:b w:val="0"/>
-          <w:color w:val="15212B"/>
+          <w:rFonts w:ascii="Arial" w:hAnsi="Arial"/>
           <w:sz w:val="22"/>
-          <w:rtl w:val="1"/>
-          <w:rtl w:val="1"/>
+          <w:rtl/>
         </w:rPr>
-        <w:t>اپ عمومی، نمودار مدل، Burndown، Jira/Notion package و گزارش بازخورد را در تب‌های جدا باز کنید.</w:t>
+        <w:t>اپ عمومی، نمودار مدل، Burndown، برد واقعی Jira، دانشنامه واقعی Notion و گزارش بازخورد را در تب‌های جدا باز کنید.</w:t>
       </w:r>
     </w:p>
     <w:p>
@@ -1610,6 +1607,87 @@
         <w:t xml:space="preserve"> بخشی از ثبت‌ها در پایان، بر اساس تاریخچه Git و فایل‌های موجود به پلتفرم منتقل شده است؛ تاریخ واقعی کار و شاهد هر مورد جدا ثبت می‌شود و تاریخچه پلتفرم جعل نشده است.</w:t>
       </w:r>
     </w:p>
+    <w:p>
+      <w:pPr>
+        <w:spacing w:before="200" w:after="120"/>
+        <w:jc w:val="right"/>
+        <w:bidi/>
+      </w:pPr>
+      <w:r>
+        <w:rPr>
+          <w:rFonts w:ascii="Arial" w:hAnsi="Arial"/>
+          <w:b/>
+          <w:color w:val="0B6770"/>
+          <w:sz w:val="32"/>
+          <w:rtl/>
+        </w:rPr>
+        <w:t>لینک‌های آماده پیش از ضبط</w:t>
+      </w:r>
+    </w:p>
+    <w:p>
+      <w:pPr>
+        <w:pStyle w:val="ListBullet"/>
+        <w:spacing w:after="80"/>
+        <w:jc w:val="right"/>
+        <w:bidi/>
+      </w:pPr>
+      <w:r>
+        <w:rPr>
+          <w:rFonts w:ascii="Arial" w:hAnsi="Arial"/>
+          <w:sz w:val="22"/>
+          <w:rtl/>
+        </w:rPr>
+        <w:t>وب‌اپ: https://aminhatesprogramming.github.io/emergency-triage-mvp/</w:t>
+      </w:r>
+    </w:p>
+    <w:p>
+      <w:pPr>
+        <w:pStyle w:val="ListBullet"/>
+        <w:spacing w:after="80"/>
+        <w:jc w:val="right"/>
+        <w:bidi/>
+      </w:pPr>
+      <w:r>
+        <w:rPr>
+          <w:rFonts w:ascii="Arial" w:hAnsi="Arial"/>
+          <w:sz w:val="22"/>
+          <w:rtl/>
+        </w:rPr>
+        <w:t>Jira: https://pourmand.atlassian.net/jira/software/projects/EMD/board</w:t>
+      </w:r>
+    </w:p>
+    <w:p>
+      <w:pPr>
+        <w:pStyle w:val="ListBullet"/>
+        <w:spacing w:after="80"/>
+        <w:jc w:val="right"/>
+        <w:bidi/>
+      </w:pPr>
+      <w:r>
+        <w:rPr>
+          <w:rFonts w:ascii="Arial" w:hAnsi="Arial"/>
+          <w:sz w:val="22"/>
+          <w:rtl/>
+        </w:rPr>
+        <w:t>Notion: https://app.notion.com/p/38fd955c965a80c18b7ac3a8fd176cc3</w:t>
+      </w:r>
+    </w:p>
+    <w:p>
+      <w:pPr>
+        <w:pStyle w:val="ListBullet"/>
+        <w:spacing w:after="80"/>
+        <w:jc w:val="right"/>
+        <w:bidi/>
+      </w:pPr>
+      <w:r>
+        <w:rPr>
+          <w:rFonts w:ascii="Arial" w:hAnsi="Arial"/>
+          <w:sz w:val="22"/>
+          <w:rtl/>
+        </w:rPr>
+        <w:t>GitHub: https://github.com/AminHatesProgramming/emergency-triage-mvp</w:t>
+      </w:r>
+    </w:p>
     <w:sectPr>
       <w:headerReference w:type="default" r:id="rId9"/>
       <w:footerReference w:type="default" r:id="rId10"/>

</xml_diff>

<commit_message>
Finalize synchronized evidence and release artifacts
</commit_message>
<xml_diff>
--- a/docs/deliverables/Emdadyar_Final_Presentation_Runbook.docx
+++ b/docs/deliverables/Emdadyar_Final_Presentation_Runbook.docx
@@ -4,6 +4,7 @@
   <w:body>
     <w:p>
       <w:pPr>
+        <w:pStyle w:val="Heading1"/>
         <w:spacing w:before="0" w:after="200"/>
         <w:jc w:val="right"/>
         <w:keepNext/>
@@ -17,11 +18,12 @@
           <w:sz w:val="48"/>
           <w:rtl w:val="1"/>
         </w:rPr>
-        <w:t>سناریوی نهایی ارائه ۱۰ دقیقه‌ای امدادیار</w:t>
+        <w:t>سناریوی نهایی ارائه ۱۰ دقیقه‌ای امداد یار</w:t>
       </w:r>
     </w:p>
     <w:p>
       <w:pPr>
+        <w:pStyle w:val="Heading2"/>
         <w:spacing w:before="320" w:after="160"/>
         <w:jc w:val="right"/>
         <w:keepNext/>
@@ -432,6 +434,7 @@
     </w:p>
     <w:p>
       <w:pPr>
+        <w:pStyle w:val="Heading2"/>
         <w:spacing w:before="320" w:after="160"/>
         <w:jc w:val="right"/>
         <w:keepNext/>
@@ -561,6 +564,7 @@
     </w:p>
     <w:p>
       <w:pPr>
+        <w:pStyle w:val="Heading2"/>
         <w:spacing w:before="320" w:after="160"/>
         <w:jc w:val="right"/>
         <w:keepNext/>
@@ -579,6 +583,7 @@
     </w:p>
     <w:p>
       <w:pPr>
+        <w:pStyle w:val="Heading3"/>
         <w:spacing w:before="220" w:after="100"/>
         <w:jc w:val="right"/>
         <w:keepNext/>
@@ -621,7 +626,7 @@
           <w:rtl w:val="1"/>
           <w:rtl w:val="1"/>
         </w:rPr>
-        <w:t xml:space="preserve"> صفحه اول امدادیار.</w:t>
+        <w:t xml:space="preserve"> صفحه اول امداد یار.</w:t>
       </w:r>
     </w:p>
     <w:p>
@@ -639,11 +644,12 @@
           <w:rtl w:val="1"/>
           <w:rtl w:val="1"/>
         </w:rPr>
-        <w:t>«سلام. پروژه ما امدادیار است؛ یک سامانه پشتیبان تصمیم برای ارزیابی اولیه و اولویت‌بندی بیماران اورژانسی. مسئله از یک نیاز روشن شروع شد: در محیط شلوغ، فشار زمان و ناقص بودن اطلاعات می‌تواند شناسایی بیمار پرخطر را دشوار کند. امدادیار تشخیص پزشکی نمی‌دهد و جایگزین پزشک یا پرستار نیست؛ فقط یک ارزیابی اولیه قابل بازبینی ارائه می‌کند.»</w:t>
+        <w:t>«سلام. پروژه ما امداد یار است؛ یک سامانه پشتیبان تصمیم برای ارزیابی اولیه و اولویت‌بندی بیماران اورژانسی. مسئله از یک نیاز روشن شروع شد: در محیط شلوغ، فشار زمان و ناقص بودن اطلاعات می‌تواند شناسایی بیمار پرخطر را دشوار کند. امداد یار تشخیص پزشکی نمی‌دهد و جایگزین پزشک یا پرستار نیست؛ فقط یک ارزیابی اولیه قابل بازبینی ارائه می‌کند.»</w:t>
       </w:r>
     </w:p>
     <w:p>
       <w:pPr>
+        <w:pStyle w:val="Heading3"/>
         <w:spacing w:before="220" w:after="100"/>
         <w:jc w:val="right"/>
         <w:keepNext/>
@@ -709,6 +715,7 @@
     </w:p>
     <w:p>
       <w:pPr>
+        <w:pStyle w:val="Heading3"/>
         <w:spacing w:before="220" w:after="100"/>
         <w:jc w:val="right"/>
         <w:keepNext/>
@@ -771,6 +778,7 @@
     </w:p>
     <w:p>
       <w:pPr>
+        <w:pStyle w:val="Heading3"/>
         <w:spacing w:before="220" w:after="100"/>
         <w:jc w:val="right"/>
         <w:keepNext/>
@@ -836,6 +844,7 @@
     </w:p>
     <w:p>
       <w:pPr>
+        <w:pStyle w:val="Heading3"/>
         <w:spacing w:before="220" w:after="100"/>
         <w:jc w:val="right"/>
         <w:keepNext/>
@@ -901,6 +910,7 @@
     </w:p>
     <w:p>
       <w:pPr>
+        <w:pStyle w:val="Heading3"/>
         <w:spacing w:before="220" w:after="100"/>
         <w:jc w:val="right"/>
         <w:keepNext/>
@@ -966,6 +976,7 @@
     </w:p>
     <w:p>
       <w:pPr>
+        <w:pStyle w:val="Heading3"/>
         <w:spacing w:before="220" w:after="100"/>
         <w:jc w:val="right"/>
         <w:keepNext/>
@@ -1002,6 +1013,7 @@
     </w:p>
     <w:p>
       <w:pPr>
+        <w:pStyle w:val="Heading2"/>
         <w:spacing w:before="320" w:after="160"/>
         <w:jc w:val="right"/>
         <w:keepNext/>
@@ -1020,6 +1032,7 @@
     </w:p>
     <w:p>
       <w:pPr>
+        <w:pStyle w:val="Heading3"/>
         <w:spacing w:before="220" w:after="100"/>
         <w:jc w:val="right"/>
         <w:keepNext/>
@@ -1085,6 +1098,7 @@
     </w:p>
     <w:p>
       <w:pPr>
+        <w:pStyle w:val="Heading3"/>
         <w:spacing w:before="220" w:after="100"/>
         <w:jc w:val="right"/>
         <w:keepNext/>
@@ -1147,6 +1161,7 @@
     </w:p>
     <w:p>
       <w:pPr>
+        <w:pStyle w:val="Heading3"/>
         <w:spacing w:before="220" w:after="100"/>
         <w:jc w:val="right"/>
         <w:keepNext/>
@@ -1207,11 +1222,12 @@
           <w:rtl w:val="1"/>
           <w:rtl w:val="1"/>
         </w:rPr>
-        <w:t>«دانش پروژه در یک مجموعه ساختاریافته نگهداری می‌شود: معماری، API، Model Card، تصمیم‌ها، تغییرات، صورت‌جلسه‌ها، Sprint Notes، ریسک‌ها، درس‌آموخته‌ها و گزارش استفاده از AI. هر سند مالک و شاهد دارد تا دانش پروژه به حافظه یک نفر وابسته نباشد. حالا محمدرضا کنترل پروژه و نتایج را جمع‌بندی می‌کند.»</w:t>
+        <w:t>«دانش پروژه در یک مجموعه ساختاریافته نگهداری می‌شود: معماری، API، Model Card، تصمیم‌ها، تغییرات، یادداشت‌های هم‌راستاسازی، Sprint Notes، ریسک‌ها، درس‌آموخته‌ها و حاکمیت ابزارهای کمکی. هر سند مالک و شاهد دارد تا دانش پروژه به حافظه یک نفر وابسته نباشد. حالا محمدرضا کنترل پروژه و نتایج را جمع‌بندی می‌کند.»</w:t>
       </w:r>
     </w:p>
     <w:p>
       <w:pPr>
+        <w:pStyle w:val="Heading2"/>
         <w:spacing w:before="320" w:after="160"/>
         <w:jc w:val="right"/>
         <w:keepNext/>
@@ -1230,6 +1246,7 @@
     </w:p>
     <w:p>
       <w:pPr>
+        <w:pStyle w:val="Heading3"/>
         <w:spacing w:before="220" w:after="100"/>
         <w:jc w:val="right"/>
         <w:keepNext/>
@@ -1295,6 +1312,7 @@
     </w:p>
     <w:p>
       <w:pPr>
+        <w:pStyle w:val="Heading3"/>
         <w:spacing w:before="220" w:after="100"/>
         <w:jc w:val="right"/>
         <w:keepNext/>
@@ -1360,6 +1378,7 @@
     </w:p>
     <w:p>
       <w:pPr>
+        <w:pStyle w:val="Heading3"/>
         <w:spacing w:before="220" w:after="100"/>
         <w:jc w:val="right"/>
         <w:keepNext/>
@@ -1420,11 +1439,12 @@
           <w:rtl w:val="1"/>
           <w:rtl w:val="1"/>
         </w:rPr>
-        <w:t>«دستاورد واقعی فعلی شامل وب‌اپ عمومی، ۹ بازخورد تخصصی تأییدشده و شروع ارتباط با دو مرکز درمانی است. این شواهد را از پیش‌بینی جذب کاربر جدا نگه داشته‌ایم. مرحله بعد، پیگیری جلسات، پایلوت کنترل‌شده و اعتبارسنجی بالینی است. امدادیار فقط یک مدل نیست؛ محصولی است که فرایند، دانش، منابع، ریسک و نتیجه آن ثبت شده و مسیر ادامه واقعی دارد. ممنون از توجه شما.»</w:t>
+        <w:t>«دستاورد واقعی فعلی شامل وب‌اپ عمومی، ۹ بازخورد تخصصی تأییدشده و شروع ارتباط با دو مرکز درمانی است. این شواهد را از پیش‌بینی جذب کاربر جدا نگه داشته‌ایم. مرحله بعد، پیگیری جلسات، پایلوت کنترل‌شده و اعتبارسنجی بالینی است. امداد یار فقط یک مدل نیست؛ محصولی است که فرایند، دانش، منابع، ریسک و نتیجه آن ثبت شده و مسیر ادامه واقعی دارد. ممنون از توجه شما.»</w:t>
       </w:r>
     </w:p>
     <w:p>
       <w:pPr>
+        <w:pStyle w:val="Heading2"/>
         <w:spacing w:before="320" w:after="160"/>
         <w:jc w:val="right"/>
         <w:keepNext/>
@@ -1563,7 +1583,7 @@
           <w:rtl w:val="1"/>
           <w:rtl w:val="1"/>
         </w:rPr>
-        <w:t>نقش AI چه بود؟</w:t>
+        <w:t>نقش ابزارهای هوشمند چه بود؟</w:t>
       </w:r>
       <w:r>
         <w:rPr>
@@ -1740,7 +1760,7 @@
         <w:sz w:val="18"/>
         <w:rtl w:val="1"/>
       </w:rPr>
-      <w:t>امداد یار | سناریوی ارائه ۱۰ دقیقه‌ای</w:t>
+      <w:t>امداد یار | سناریوی نهایی ارائه</w:t>
     </w:r>
   </w:p>
 </w:hdr>

</xml_diff>